<commit_message>
Correct result claims and retry handling before handbook merge
</commit_message>
<xml_diff>
--- a/Revised Sprint 1 Deliverables/1. Revised Scope of Work.docx
+++ b/Revised Sprint 1 Deliverables/1. Revised Scope of Work.docx
@@ -379,7 +379,7 @@
               <w:t>Partly met.</w:t>
             </w:r>
             <w:r>
-              <w:t xml:space="preserve"> Two model runs: one complete evaluation on TruckScenes </w:t>
+              <w:t xml:space="preserve"> One scored TruckScenes </w:t>
             </w:r>
             <w:r>
               <w:rPr>
@@ -389,7 +389,7 @@
               <w:t>mini_val</w:t>
             </w:r>
             <w:r>
-              <w:t>, one partial on GOOSE. Range-banded reporting not yet done</w:t>
+              <w:t xml:space="preserve"> submission and one partial GOOSE run. Inference completion on empty TruckScenes entries needs verification; range-banded reporting not yet done</w:t>
             </w:r>
           </w:p>
         </w:tc>
@@ -1688,7 +1688,7 @@
               <w:rPr>
                 <w:b/>
               </w:rPr>
-              <w:t>Strand closed out 5 Sep</w:t>
+              <w:t>Characterisation complete; closeout proposed</w:t>
             </w:r>
           </w:p>
         </w:tc>
@@ -1875,10 +1875,10 @@
         <w:rPr>
           <w:i/>
         </w:rPr>
-        <w:t>TruckScenes — complete.</w:t>
+        <w:t>TruckScenes — scored submission.</w:t>
       </w:r>
       <w:r>
-        <w:t xml:space="preserve"> FCOS3D, nuScenes-pretrained, run zero-shot on CPU across all 80 </w:t>
+        <w:t xml:space="preserve"> A nuScenes-pretrained FCOS3D detector ran zero-shot on CPU using CAMERA_LEFT_FRONT. The submitted file covers all 80 </w:t>
       </w:r>
       <w:r>
         <w:rPr>
@@ -1888,7 +1888,7 @@
         <w:t>mini_val</w:t>
       </w:r>
       <w:r>
-        <w:t xml:space="preserve"> samples. </w:t>
+        <w:t xml:space="preserve"> sample tokens, with 959 boxes across 63 nonempty entries, and the saved evaluator reports </w:t>
       </w:r>
       <w:r>
         <w:rPr>
@@ -1897,7 +1897,21 @@
         <w:t>mAP 0.0000</w:t>
       </w:r>
       <w:r>
-        <w:t>, diagnosed as monocular depth misestimation from a camera-height domain gap — TruckScenes cameras sit at ~2.1 m against the ~1.5 m car-mounted cameras the model was trained on. Depth errors of 5–21 m scaling with range are the signature of that failure; a coordinate-transform bug was explicitly ruled out by reusing the reference implementation's own conversion code. Scope cut recorded: one of four cameras, which caps recall but cannot explain a zero.</w:t>
+        <w:t>. The runner pre-fills empty entries, so token coverage alone does not prove that inference completed on the 17 empty samples. Preserve the author's reported 80-sample run, but verify completion logs before treating those entries as confirmed no-detection outputs.</w:t>
+      </w:r>
+    </w:p>
+    <w:p>
+      <w:r>
+        <w:t xml:space="preserve">Camera-height/domain shift is a </w:t>
+      </w:r>
+      <w:r>
+        <w:rPr>
+          <w:b/>
+        </w:rPr>
+        <w:t>hypothesis</w:t>
+      </w:r>
+      <w:r>
+        <w:t>, not an isolated cause. Reusing reference conversion code does not verify TruckScenes calibration or rule out integration errors. Check known geometry and predictions against ground truth visible to the selected camera before attributing the zero to depth estimation. Single-camera coverage and classes the checkpoint cannot predict also limit this protocol; no range-banded result is recorded.</w:t>
       </w:r>
     </w:p>
     <w:p>
@@ -1908,7 +1922,16 @@
         <w:t>GOOSE — partial.</w:t>
       </w:r>
       <w:r>
-        <w:t xml:space="preserve"> PTv3 executed on the team's GTX 1660 in FP32 at ~19 s/frame, stopped deliberately after 10 of 961 frames. Recorded as diagnostics, not metrics, because a partial run is not a benchmark. A full pass is ~5.1 hours of sustained load.</w:t>
+        <w:t xml:space="preserve"> PTv3 executed on the team's GTX 1660 in FP32 under a patched protocol, stopped deliberately after 10 of 961 frames. Its ~19 s/frame loop-body timing excludes data loading. Extrapolating it gives ~5.1 hours for 961 frames, </w:t>
+      </w:r>
+      <w:r>
+        <w:rPr>
+          <w:b/>
+        </w:rPr>
+        <w:t>not a measured full-run cost</w:t>
+      </w:r>
+      <w:r>
+        <w:t>. No full-split score or resource measurement exists.</w:t>
       </w:r>
     </w:p>
     <w:p>
@@ -1916,10 +1939,10 @@
         <w:rPr>
           <w:b/>
         </w:rPr>
-        <w:t>Taken together these answer the question Adrian actually asked</w:t>
+        <w:t>These runs establish bounded progress on the client's model question.</w:t>
       </w:r>
       <w:r>
-        <w:t xml:space="preserve"> — whether an off-the-shelf model can be made to run on this data, and how it performs. One says yes and scores zero for a specific, diagnosed reason. The other says the pipeline works and the cost is five hours.</w:t>
+        <w:t xml:space="preserve"> Camera inference produced a scored TruckScenes submission whose zero still needs diagnosis; GOOSE inference worked on ten frames. Neither establishes a radar/LiDAR comparison, long-range detection performance or the cost of a full-dataset run.</w:t>
       </w:r>
     </w:p>
     <w:p>
@@ -2135,7 +2158,7 @@
           <w:p>
             <w:r/>
             <w:r>
-              <w:t>Store and metrics built; one partial run</w:t>
+              <w:t>Store and metrics built; one scored camera submission and one partial GOOSE run</w:t>
             </w:r>
           </w:p>
         </w:tc>
@@ -2146,7 +2169,7 @@
           <w:p>
             <w:r/>
             <w:r>
-              <w:t>Compute blocked on Kaya</w:t>
+              <w:t>Matched model/modality comparison pending; large-scale compute still unresolved</w:t>
             </w:r>
           </w:p>
         </w:tc>

</xml_diff>